<commit_message>
Add Northeast regional 10 m product: Fig 8, Results 3.11, disturbance-robustness note
- New Results subsection 3.11 and Figure 8 (NH/VT/NY/NB 10 m LSOG probability)
- Disturbance-layer robustness result in 4.4a (AUC 0.860 to 0.863)
- render_regional_10m.R; build scripts wire in the regional figure
- Rebuilt V2/main/SI; writing-quality pass (legend tic fixed)
- Mirrors Zenodo v3.4.0 (DOI 10.5281/zenodo.20802360; concept 20614496)
</commit_message>
<xml_diff>
--- a/manuscript/Northeast_LSOG_Manuscript_SI.docx
+++ b/manuscript/Northeast_LSOG_Manuscript_SI.docx
@@ -7532,6 +7532,7 @@
       </w:r>
     </w:p>
     <w:sectPr>
+      <w:footerReference w:type="default" r:id="rId7"/>
       <w:pgSz w:w="12240" w:h="15840" w:orient="portrait"/>
       <w:pgMar w:top="1440" w:right="1440" w:bottom="1440" w:left="1440" w:header="708" w:footer="708" w:gutter="0"/>
       <w:pgNumType/>
@@ -7580,6 +7581,26 @@
     </w:p>
   </w:endnote>
 </w:endnotes>
+</file>
+
+<file path=word/footer1.xml><?xml version="1.0" encoding="utf-8"?>
+<w:ftr xmlns:wpc="http://schemas.microsoft.com/office/word/2010/wordprocessingCanvas" xmlns:mc="http://schemas.openxmlformats.org/markup-compatibility/2006" xmlns:o="urn:schemas-microsoft-com:office:office" xmlns:r="http://schemas.openxmlformats.org/officeDocument/2006/relationships" xmlns:m="http://schemas.openxmlformats.org/officeDocument/2006/math" xmlns:v="urn:schemas-microsoft-com:vml" xmlns:wp14="http://schemas.microsoft.com/office/word/2010/wordprocessingDrawing" xmlns:wp="http://schemas.openxmlformats.org/drawingml/2006/wordprocessingDrawing" xmlns:w10="urn:schemas-microsoft-com:office:word" xmlns:w="http://schemas.openxmlformats.org/wordprocessingml/2006/main" xmlns:w14="http://schemas.microsoft.com/office/word/2010/wordml" xmlns:w15="http://schemas.microsoft.com/office/word/2012/wordml" xmlns:wpg="http://schemas.microsoft.com/office/word/2010/wordprocessingGroup" xmlns:wpi="http://schemas.microsoft.com/office/word/2010/wordprocessingInk" xmlns:wne="http://schemas.microsoft.com/office/word/2006/wordml" xmlns:wps="http://schemas.microsoft.com/office/word/2010/wordprocessingShape">
+  <w:p>
+    <w:pPr>
+      <w:jc w:val="center"/>
+    </w:pPr>
+    <w:r>
+      <w:rPr>
+        <w:sz w:val="20"/>
+        <w:szCs w:val="20"/>
+      </w:rPr>
+      <w:fldChar w:fldCharType="begin"/>
+      <w:instrText xml:space="preserve">PAGE</w:instrText>
+      <w:fldChar w:fldCharType="separate"/>
+      <w:fldChar w:fldCharType="end"/>
+    </w:r>
+  </w:p>
+</w:ftr>
 </file>
 
 <file path=word/footnotes.xml><?xml version="1.0" encoding="utf-8"?>

</xml_diff>